<commit_message>
Arc wine app freelance: score 72; Meta Ads Manager hands-on and app-install/TikTok work confirmed
Co-Authored-By: Claude Opus 5.5 <noreply@anthropic.com>
Claude-Session: https://claude.ai/code/session_018DEej5NGjq1omj9BTtvEiy
</commit_message>
<xml_diff>
--- a/applications/arc-ai-wine-app-growth-marketer/Arc-WineApp-GrowthMarketer-CoverLetter.docx
+++ b/applications/arc-ai-wine-app-growth-marketer/Arc-WineApp-GrowthMarketer-CoverLetter.docx
@@ -94,7 +94,7 @@
           <w:b w:val="0"/>
           <w:color w:val="1A1A1A"/>
         </w:rPr>
-        <w:t>An early-stage app needs paid spend that's measurable from the first dollar, and that's where I'd start. I'm Meta Ads certified and set up the tracking side myself: Meta Pixel and conversion events, Google Ads conversions, GA4, and UTM conventions. At Level Agency I managed paid media for accounts spending $20K+ a month, set budgets, and A/B tested creative and audiences.</w:t>
+        <w:t>An early-stage app needs paid spend that's measurable from the first dollar, and that's where I'd start. I'm Meta Ads certified and hands-on in Ads Manager, I've run app-install and TikTok campaign work, and I set up the tracking side myself: Meta Pixel and conversion events, Google Ads conversions, GA4, and UTM conventions. At Level Agency I managed paid media for accounts spending $20K+ a month, set budgets, and A/B tested creative and audiences.</w:t>
       </w:r>
     </w:p>
     <w:p>
@@ -120,7 +120,7 @@
           <w:b w:val="0"/>
           <w:color w:val="1A1A1A"/>
         </w:rPr>
-        <w:t>To be direct: my paid work has been web conversion campaigns, not app-install campaigns or the Meta SDK, and I haven't run TikTok ads. The strategy, creative testing, and measurement discipline carry over, and I'd ramp on the app-specific setup fast. Open to a conversation at 303-726-5037 or jrotnbrg@gmail.com.</w:t>
+        <w:t>In the first week I'd confirm your Meta SDK and conversion events are firing cleanly, then launch tight creative and copy tests so the budget goes to what's actually converting. App Store Optimization is where I'd lean on your team at first. My rate is $50/hour. Open to a conversation at 303-726-5037 or jrotnbrg@gmail.com.</w:t>
       </w:r>
     </w:p>
     <w:p>

</xml_diff>